<commit_message>
Kisisel veri temizligi: sahiplik "Scryne", eski portfolyo brifingi kaldirildi
Belgelerdeki sahiplik/telif satirlari takma adla (Scryne) degisti; demo ve test
verisindeki gercek ad jenerik bir adla degisti. PORTFOLYO-BRIFING.md repodan
cikti (yerini repo disindaki portfolyo metni aldi).

Co-Authored-By: Claude Opus 5.5 <noreply@anthropic.com>
</commit_message>
<xml_diff>
--- a/TenderIQ_Proje_Plani.docx
+++ b/TenderIQ_Proje_Plani.docx
@@ -303,7 +303,7 @@
                 <w:sz w:val="20"/>
                 <w:szCs w:val="20"/>
               </w:rPr>
-              <w:t xml:space="preserve">Berkay (GitHub: Scryne)</w:t>
+              <w:t xml:space="preserve">Scryne</w:t>
             </w:r>
           </w:p>
         </w:tc>
@@ -9958,7 +9958,7 @@
           <w:sz w:val="21"/>
           <w:szCs w:val="21"/>
         </w:rPr>
-        <w:t xml:space="preserve">Berkay'ın FabrikaOS'ta uyguladığı çok kiracılı SaaS deneyimi doğrudan uygulanabilir. TenderIQ için önerilen model, PostgreSQL Row-Level Security (RLS) ile satır bazlı izolasyondur:</w:t>
+        <w:t xml:space="preserve">Scryne'ın FabrikaOS'ta uyguladığı çok kiracılı SaaS deneyimi doğrudan uygulanabilir. TenderIQ için önerilen model, PostgreSQL Row-Level Security (RLS) ile satır bazlı izolasyondur:</w:t>
       </w:r>
     </w:p>
     <w:p>
@@ -12613,7 +12613,7 @@
           <w:sz w:val="21"/>
           <w:szCs w:val="21"/>
         </w:rPr>
-        <w:t xml:space="preserve">Seçimler iki ilkeye göre yapılmıştır: (1) 2026 için en güncel ve en iyi olanı seçmek, (2) tek geliştiricinin verimli ve mevcut deneyimiyle uyumlu ilerleyebilmesi. Berkay'ın Python, React/TypeScript, Redis, Celery, GitHub Actions ve çok kiracılı SaaS deneyimi doğrudan değerlendirilmiştir.</w:t>
+        <w:t xml:space="preserve">Seçimler iki ilkeye göre yapılmıştır: (1) 2026 için en güncel ve en iyi olanı seçmek, (2) tek geliştiricinin verimli ve mevcut deneyimiyle uyumlu ilerleyebilmesi. Scryne'ın Python, React/TypeScript, Redis, Celery, GitHub Actions ve çok kiracılı SaaS deneyimi doğrudan değerlendirilmiştir.</w:t>
       </w:r>
     </w:p>
     <w:p>
@@ -12820,7 +12820,7 @@
                 <w:sz w:val="19"/>
                 <w:szCs w:val="19"/>
               </w:rPr>
-              <w:t xml:space="preserve">Berkay'ın React/TS deneyimi; SSR/rota yapısı, olgun ekosistem</w:t>
+              <w:t xml:space="preserve">Scryne'ın React/TS deneyimi; SSR/rota yapısı, olgun ekosistem</w:t>
             </w:r>
           </w:p>
         </w:tc>
@@ -13170,7 +13170,7 @@
                 <w:sz w:val="19"/>
                 <w:szCs w:val="19"/>
               </w:rPr>
-              <w:t xml:space="preserve">İş ilerleme bildirimi; Berkay'ın Socket.IO deneyimi mevcut</w:t>
+              <w:t xml:space="preserve">İş ilerleme bildirimi; Scryne'ın Socket.IO deneyimi mevcut</w:t>
             </w:r>
           </w:p>
         </w:tc>
@@ -13469,7 +13469,7 @@
                 <w:sz w:val="19"/>
                 <w:szCs w:val="19"/>
               </w:rPr>
-              <w:t xml:space="preserve">Berkay'ın mevcut deneyimi; uzun doküman işleri için olgun kuyruk</w:t>
+              <w:t xml:space="preserve">Scryne'ın mevcut deneyimi; uzun doküman işleri için olgun kuyruk</w:t>
             </w:r>
           </w:p>
         </w:tc>
@@ -13555,7 +13555,7 @@
                 <w:sz w:val="19"/>
                 <w:szCs w:val="19"/>
               </w:rPr>
-              <w:t xml:space="preserve">Berkay Alembic'i aktif kullanıyor; olgun ve esnek</w:t>
+              <w:t xml:space="preserve">Scryne Alembic'i aktif kullanıyor; olgun ve esnek</w:t>
             </w:r>
           </w:p>
         </w:tc>
@@ -14853,7 +14853,7 @@
                 <w:sz w:val="18"/>
                 <w:szCs w:val="18"/>
               </w:rPr>
-              <w:t xml:space="preserve">Berkay'ın mevcut deneyimi; test + build + deploy hattı</w:t>
+              <w:t xml:space="preserve">Scryne'ın mevcut deneyimi; test + build + deploy hattı</w:t>
             </w:r>
           </w:p>
         </w:tc>
@@ -18671,7 +18671,7 @@
           <w:sz w:val="21"/>
           <w:szCs w:val="21"/>
         </w:rPr>
-        <w:t xml:space="preserve">Berkay'ın mevcut GitHub Actions deneyimi doğrudan uygulanır. Hat aşamaları:</w:t>
+        <w:t xml:space="preserve">Scryne'ın mevcut GitHub Actions deneyimi doğrudan uygulanır. Hat aşamaları:</w:t>
       </w:r>
     </w:p>
     <w:p>
@@ -22139,7 +22139,7 @@
           <w:sz w:val="21"/>
           <w:szCs w:val="21"/>
         </w:rPr>
-        <w:t xml:space="preserve">"Herkese ihale analizi" yerine tek bir dikeyde kazanmak: başlangıç için kamu BT/yazılım ihalelerine düzenli giren firmalar ve ihale danışmanları. Bu segment; Berkay'ın teknik alan bilgisine yakın, acısı keskin ve ulaşılabilir bir topluluğa sahiptir.</w:t>
+        <w:t xml:space="preserve">"Herkese ihale analizi" yerine tek bir dikeyde kazanmak: başlangıç için kamu BT/yazılım ihalelerine düzenli giren firmalar ve ihale danışmanları. Bu segment; Scryne'ın teknik alan bilgisine yakın, acısı keskin ve ulaşılabilir bir topluluğa sahiptir.</w:t>
       </w:r>
     </w:p>
     <w:p>

</xml_diff>